<commit_message>
Remove earlier-draft paragraph and verbal-draft appendix from manuscript
Co-Authored-By: Claude Sonnet 5.5 <noreply@anthropic.com>
Claude-Session: https://claude.ai/code/session_01F6PamX7mJ2YAyvRTGYYhJd
</commit_message>
<xml_diff>
--- a/ISR_Staging_Commitment_manuscript_3.docx
+++ b/ISR_Staging_Commitment_manuscript_3.docx
@@ -292,25 +292,6 @@
           <w:szCs w:val="22"/>
         </w:rPr>
         <w:t xml:space="preserve">Generative maintenance repeats the structure at weekly frequency and breaks the attachment. A second model scores the live policy. An optimizer searches for a prompt or adapter that raises the score. A release review treats the rise as evidence that quality improved. Promotion is costly to reverse because users see the change, logs shift, and the next training set inherits the new behavior. Rollback does not restore the prior. The quote is cheap, endogenous to search, and versionable without notice.</w:t>
-      </w:r>
-    </w:p>
-    <w:p>
-      <w:pPr>
-        <w:spacing w:after="0" w:before="0" w:line="480" w:lineRule="auto"/>
-        <w:jc w:val="both"/>
-      </w:pPr>
-      <w:r>
-        <w:rPr>
-          <w:rFonts w:ascii="Times New Roman" w:cs="Times New Roman" w:eastAsia="Times New Roman" w:hAnsi="Times New Roman"/>
-          <w:b w:val="false"/>
-          <w:bCs w:val="false"/>
-          <w:i w:val="false"/>
-          <w:iCs w:val="false"/>
-          <w:color w:val="000000"/>
-          <w:sz w:val="22"/>
-          <w:szCs w:val="22"/>
-        </w:rPr>
-        <w:t xml:space="preserve">An earlier draft of this argument named the objects — wait, pilot, abandon, pin — and stated five propositions in words. The exercise rule was an inequality in an option premium that was not derived. A rise in noise raising that premium is Dixit and Pindyck (1994), not a result about judges. This paper replaces the verbal rule with an investment problem whose observation equation the decision maker is also optimizing, and reports the exercise threshold, the selection probability, and the value of inspection in closed form.</w:t>
       </w:r>
     </w:p>
     <w:p>
@@ -9292,844 +9273,6 @@
           <w:szCs w:val="22"/>
         </w:rPr>
         <w:t xml:space="preserve">Strict rule and linking. A strict reversal has a title that begins with revert, rollback, undo, restore, or back out, is not in an archive repository, and changes at least one non-documentation file. To link a reversal to the ship it undoes, we scan up to 50 earlier commits in the same repository and compute the share of the earlier commit’s removed lines that reappear as added lines in the reversal, over non-documentation files shared by the two commits. Large files are compared through their pointer hashes. We accept the best candidate when the share is at least 0.5; all twelve accepted links have a share of 1.0. Four strict reversals have no linked ship.</w:t>
-      </w:r>
-    </w:p>
-    <w:p>
-      <w:pPr>
-        <w:pStyle w:val="Heading1"/>
-        <w:spacing w:after="120" w:before="240" w:line="480" w:lineRule="auto"/>
-      </w:pPr>
-      <w:r>
-        <w:rPr>
-          <w:rFonts w:ascii="Times New Roman" w:cs="Times New Roman" w:eastAsia="Times New Roman" w:hAnsi="Times New Roman"/>
-          <w:b/>
-          <w:bCs/>
-          <w:i w:val="false"/>
-          <w:iCs w:val="false"/>
-          <w:color w:val="000000"/>
-          <w:sz w:val="24"/>
-          <w:szCs w:val="24"/>
-        </w:rPr>
-        <w:t xml:space="preserve">Appendix C. Mapping from the Verbal Draft</w:t>
-      </w:r>
-    </w:p>
-    <w:p>
-      <w:pPr>
-        <w:spacing w:after="0" w:before="0" w:line="480" w:lineRule="auto"/>
-        <w:jc w:val="both"/>
-      </w:pPr>
-      <w:r>
-        <w:rPr>
-          <w:rFonts w:ascii="Times New Roman" w:cs="Times New Roman" w:eastAsia="Times New Roman" w:hAnsi="Times New Roman"/>
-          <w:b w:val="false"/>
-          <w:bCs w:val="false"/>
-          <w:i w:val="false"/>
-          <w:iCs w:val="false"/>
-          <w:color w:val="000000"/>
-          <w:sz w:val="22"/>
-          <w:szCs w:val="22"/>
-        </w:rPr>
-        <w:t xml:space="preserve"/>
-      </w:r>
-    </w:p>
-    <w:tbl>
-      <w:tblPr>
-        <w:tblW w:type="dxa" w:w="9360"/>
-        <w:tblBorders>
-          <w:top w:val="single" w:color="auto" w:sz="4"/>
-          <w:left w:val="single" w:color="auto" w:sz="4"/>
-          <w:bottom w:val="single" w:color="auto" w:sz="4"/>
-          <w:right w:val="single" w:color="auto" w:sz="4"/>
-          <w:insideH w:val="single" w:color="auto" w:sz="4"/>
-          <w:insideV w:val="single" w:color="auto" w:sz="4"/>
-        </w:tblBorders>
-      </w:tblPr>
-      <w:tblGrid>
-        <w:gridCol w:w="4200"/>
-        <w:gridCol w:w="5160"/>
-      </w:tblGrid>
-      <w:tr>
-        <w:trPr>
-          <w:tblHeader/>
-        </w:trPr>
-        <w:tc>
-          <w:tcPr>
-            <w:tcW w:type="dxa" w:w="4200"/>
-            <w:tcBorders>
-              <w:top w:val="single" w:color="000000" w:sz="8"/>
-              <w:left w:val="none" w:color="FFFFFF" w:sz="0"/>
-              <w:bottom w:val="single" w:color="000000" w:sz="8"/>
-              <w:right w:val="none" w:color="FFFFFF" w:sz="0"/>
-            </w:tcBorders>
-            <w:shd w:fill="F2F2F2" w:val="clear"/>
-            <w:tcMar>
-              <w:top w:type="dxa" w:w="40"/>
-              <w:left w:type="dxa" w:w="60"/>
-              <w:bottom w:type="dxa" w:w="40"/>
-              <w:right w:type="dxa" w:w="60"/>
-            </w:tcMar>
-            <w:vAlign w:val="top"/>
-          </w:tcPr>
-          <w:p>
-            <w:pPr>
-              <w:spacing w:after="0" w:before="0" w:line="276" w:lineRule="auto"/>
-            </w:pPr>
-            <w:r>
-              <w:rPr>
-                <w:rFonts w:ascii="Times New Roman" w:cs="Times New Roman" w:eastAsia="Times New Roman" w:hAnsi="Times New Roman"/>
-                <w:b/>
-                <w:bCs/>
-                <w:i w:val="false"/>
-                <w:iCs w:val="false"/>
-                <w:color w:val="000000"/>
-                <w:sz w:val="20"/>
-                <w:szCs w:val="20"/>
-              </w:rPr>
-              <w:t xml:space="preserve">Earlier object</w:t>
-            </w:r>
-          </w:p>
-        </w:tc>
-        <w:tc>
-          <w:tcPr>
-            <w:tcW w:type="dxa" w:w="5160"/>
-            <w:tcBorders>
-              <w:top w:val="single" w:color="000000" w:sz="8"/>
-              <w:left w:val="none" w:color="FFFFFF" w:sz="0"/>
-              <w:bottom w:val="single" w:color="000000" w:sz="8"/>
-              <w:right w:val="none" w:color="FFFFFF" w:sz="0"/>
-            </w:tcBorders>
-            <w:shd w:fill="F2F2F2" w:val="clear"/>
-            <w:tcMar>
-              <w:top w:type="dxa" w:w="40"/>
-              <w:left w:type="dxa" w:w="60"/>
-              <w:bottom w:type="dxa" w:w="40"/>
-              <w:right w:type="dxa" w:w="60"/>
-            </w:tcMar>
-            <w:vAlign w:val="top"/>
-          </w:tcPr>
-          <w:p>
-            <w:pPr>
-              <w:spacing w:after="0" w:before="0" w:line="276" w:lineRule="auto"/>
-            </w:pPr>
-            <w:r>
-              <w:rPr>
-                <w:rFonts w:ascii="Times New Roman" w:cs="Times New Roman" w:eastAsia="Times New Roman" w:hAnsi="Times New Roman"/>
-                <w:b/>
-                <w:bCs/>
-                <w:i w:val="false"/>
-                <w:iCs w:val="false"/>
-                <w:color w:val="000000"/>
-                <w:sz w:val="20"/>
-                <w:szCs w:val="20"/>
-              </w:rPr>
-              <w:t xml:space="preserve">Status here</w:t>
-            </w:r>
-          </w:p>
-        </w:tc>
-      </w:tr>
-      <w:tr>
-        <w:tc>
-          <w:tcPr>
-            <w:tcW w:type="dxa" w:w="4200"/>
-            <w:tcBorders>
-              <w:top w:val="none" w:color="FFFFFF" w:sz="0"/>
-              <w:left w:val="none" w:color="FFFFFF" w:sz="0"/>
-              <w:bottom w:val="single" w:color="BFBFBF" w:sz="4"/>
-              <w:right w:val="none" w:color="FFFFFF" w:sz="0"/>
-            </w:tcBorders>
-            <w:tcMar>
-              <w:top w:type="dxa" w:w="40"/>
-              <w:left w:type="dxa" w:w="60"/>
-              <w:bottom w:type="dxa" w:w="40"/>
-              <w:right w:type="dxa" w:w="60"/>
-            </w:tcMar>
-            <w:vAlign w:val="top"/>
-          </w:tcPr>
-          <w:p>
-            <w:pPr>
-              <w:spacing w:after="0" w:before="0" w:line="276" w:lineRule="auto"/>
-            </w:pPr>
-            <w:r>
-              <w:rPr>
-                <w:rFonts w:ascii="Times New Roman" w:cs="Times New Roman" w:eastAsia="Times New Roman" w:hAnsi="Times New Roman"/>
-                <w:b w:val="false"/>
-                <w:bCs w:val="false"/>
-                <w:i w:val="false"/>
-                <w:iCs w:val="false"/>
-                <w:color w:val="000000"/>
-                <w:sz w:val="20"/>
-                <w:szCs w:val="20"/>
-              </w:rPr>
-              <w:t xml:space="preserve">Verbal rule with an unpriced premium</w:t>
-            </w:r>
-          </w:p>
-        </w:tc>
-        <w:tc>
-          <w:tcPr>
-            <w:tcW w:type="dxa" w:w="5160"/>
-            <w:tcBorders>
-              <w:top w:val="none" w:color="FFFFFF" w:sz="0"/>
-              <w:left w:val="none" w:color="FFFFFF" w:sz="0"/>
-              <w:bottom w:val="single" w:color="BFBFBF" w:sz="4"/>
-              <w:right w:val="none" w:color="FFFFFF" w:sz="0"/>
-            </w:tcBorders>
-            <w:tcMar>
-              <w:top w:type="dxa" w:w="40"/>
-              <w:left w:type="dxa" w:w="60"/>
-              <w:bottom w:type="dxa" w:w="40"/>
-              <w:right w:type="dxa" w:w="60"/>
-            </w:tcMar>
-            <w:vAlign w:val="top"/>
-          </w:tcPr>
-          <w:p>
-            <w:pPr>
-              <w:spacing w:after="0" w:before="0" w:line="276" w:lineRule="auto"/>
-            </w:pPr>
-            <w:r>
-              <w:rPr>
-                <w:rFonts w:ascii="Times New Roman" w:cs="Times New Roman" w:eastAsia="Times New Roman" w:hAnsi="Times New Roman"/>
-                <w:b w:val="false"/>
-                <w:bCs w:val="false"/>
-                <w:i w:val="false"/>
-                <w:iCs w:val="false"/>
-                <w:color w:val="000000"/>
-                <w:sz w:val="20"/>
-                <w:szCs w:val="20"/>
-              </w:rPr>
-              <w:t xml:space="preserve">Replaced by (5) and (6).</w:t>
-            </w:r>
-          </w:p>
-        </w:tc>
-      </w:tr>
-      <w:tr>
-        <w:tc>
-          <w:tcPr>
-            <w:tcW w:type="dxa" w:w="4200"/>
-            <w:tcBorders>
-              <w:top w:val="none" w:color="FFFFFF" w:sz="0"/>
-              <w:left w:val="none" w:color="FFFFFF" w:sz="0"/>
-              <w:bottom w:val="single" w:color="BFBFBF" w:sz="4"/>
-              <w:right w:val="none" w:color="FFFFFF" w:sz="0"/>
-            </w:tcBorders>
-            <w:tcMar>
-              <w:top w:type="dxa" w:w="40"/>
-              <w:left w:type="dxa" w:w="60"/>
-              <w:bottom w:type="dxa" w:w="40"/>
-              <w:right w:type="dxa" w:w="60"/>
-            </w:tcMar>
-            <w:vAlign w:val="top"/>
-          </w:tcPr>
-          <w:p>
-            <w:pPr>
-              <w:spacing w:after="0" w:before="0" w:line="276" w:lineRule="auto"/>
-            </w:pPr>
-            <w:r>
-              <w:rPr>
-                <w:rFonts w:ascii="Times New Roman" w:cs="Times New Roman" w:eastAsia="Times New Roman" w:hAnsi="Times New Roman"/>
-                <w:b w:val="false"/>
-                <w:bCs w:val="false"/>
-                <w:i w:val="false"/>
-                <w:iCs w:val="false"/>
-                <w:color w:val="000000"/>
-                <w:sz w:val="20"/>
-                <w:szCs w:val="20"/>
-              </w:rPr>
-              <w:t xml:space="preserve">Proposition 1</w:t>
-            </w:r>
-          </w:p>
-        </w:tc>
-        <w:tc>
-          <w:tcPr>
-            <w:tcW w:type="dxa" w:w="5160"/>
-            <w:tcBorders>
-              <w:top w:val="none" w:color="FFFFFF" w:sz="0"/>
-              <w:left w:val="none" w:color="FFFFFF" w:sz="0"/>
-              <w:bottom w:val="single" w:color="BFBFBF" w:sz="4"/>
-              <w:right w:val="none" w:color="FFFFFF" w:sz="0"/>
-            </w:tcBorders>
-            <w:tcMar>
-              <w:top w:type="dxa" w:w="40"/>
-              <w:left w:type="dxa" w:w="60"/>
-              <w:bottom w:type="dxa" w:w="40"/>
-              <w:right w:type="dxa" w:w="60"/>
-            </w:tcMar>
-            <w:vAlign w:val="top"/>
-          </w:tcPr>
-          <w:p>
-            <w:pPr>
-              <w:spacing w:after="0" w:before="0" w:line="276" w:lineRule="auto"/>
-            </w:pPr>
-            <w:r>
-              <w:rPr>
-                <w:rFonts w:ascii="Times New Roman" w:cs="Times New Roman" w:eastAsia="Times New Roman" w:hAnsi="Times New Roman"/>
-                <w:b w:val="false"/>
-                <w:bCs w:val="false"/>
-                <w:i w:val="false"/>
-                <w:iCs w:val="false"/>
-                <w:color w:val="000000"/>
-                <w:sz w:val="20"/>
-                <w:szCs w:val="20"/>
-              </w:rPr>
-              <w:t xml:space="preserve">Theorem 1. Flip at β = a(Δ + ℓ).</w:t>
-            </w:r>
-          </w:p>
-        </w:tc>
-      </w:tr>
-      <w:tr>
-        <w:tc>
-          <w:tcPr>
-            <w:tcW w:type="dxa" w:w="4200"/>
-            <w:tcBorders>
-              <w:top w:val="none" w:color="FFFFFF" w:sz="0"/>
-              <w:left w:val="none" w:color="FFFFFF" w:sz="0"/>
-              <w:bottom w:val="single" w:color="BFBFBF" w:sz="4"/>
-              <w:right w:val="none" w:color="FFFFFF" w:sz="0"/>
-            </w:tcBorders>
-            <w:tcMar>
-              <w:top w:type="dxa" w:w="40"/>
-              <w:left w:type="dxa" w:w="60"/>
-              <w:bottom w:type="dxa" w:w="40"/>
-              <w:right w:type="dxa" w:w="60"/>
-            </w:tcMar>
-            <w:vAlign w:val="top"/>
-          </w:tcPr>
-          <w:p>
-            <w:pPr>
-              <w:spacing w:after="0" w:before="0" w:line="276" w:lineRule="auto"/>
-            </w:pPr>
-            <w:r>
-              <w:rPr>
-                <w:rFonts w:ascii="Times New Roman" w:cs="Times New Roman" w:eastAsia="Times New Roman" w:hAnsi="Times New Roman"/>
-                <w:b w:val="false"/>
-                <w:bCs w:val="false"/>
-                <w:i w:val="false"/>
-                <w:iCs w:val="false"/>
-                <w:color w:val="000000"/>
-                <w:sz w:val="20"/>
-                <w:szCs w:val="20"/>
-              </w:rPr>
-              <w:t xml:space="preserve">Proposition 2</w:t>
-            </w:r>
-          </w:p>
-        </w:tc>
-        <w:tc>
-          <w:tcPr>
-            <w:tcW w:type="dxa" w:w="5160"/>
-            <w:tcBorders>
-              <w:top w:val="none" w:color="FFFFFF" w:sz="0"/>
-              <w:left w:val="none" w:color="FFFFFF" w:sz="0"/>
-              <w:bottom w:val="single" w:color="BFBFBF" w:sz="4"/>
-              <w:right w:val="none" w:color="FFFFFF" w:sz="0"/>
-            </w:tcBorders>
-            <w:tcMar>
-              <w:top w:type="dxa" w:w="40"/>
-              <w:left w:type="dxa" w:w="60"/>
-              <w:bottom w:type="dxa" w:w="40"/>
-              <w:right w:type="dxa" w:w="60"/>
-            </w:tcMar>
-            <w:vAlign w:val="top"/>
-          </w:tcPr>
-          <w:p>
-            <w:pPr>
-              <w:spacing w:after="0" w:before="0" w:line="276" w:lineRule="auto"/>
-            </w:pPr>
-            <w:r>
-              <w:rPr>
-                <w:rFonts w:ascii="Times New Roman" w:cs="Times New Roman" w:eastAsia="Times New Roman" w:hAnsi="Times New Roman"/>
-                <w:b w:val="false"/>
-                <w:bCs w:val="false"/>
-                <w:i w:val="false"/>
-                <w:iCs w:val="false"/>
-                <w:color w:val="000000"/>
-                <w:sz w:val="20"/>
-                <w:szCs w:val="20"/>
-              </w:rPr>
-              <w:t xml:space="preserve">Theorem 2. Requires μ &gt; q and ω &gt; 1 − q.</w:t>
-            </w:r>
-          </w:p>
-        </w:tc>
-      </w:tr>
-      <w:tr>
-        <w:tc>
-          <w:tcPr>
-            <w:tcW w:type="dxa" w:w="4200"/>
-            <w:tcBorders>
-              <w:top w:val="none" w:color="FFFFFF" w:sz="0"/>
-              <w:left w:val="none" w:color="FFFFFF" w:sz="0"/>
-              <w:bottom w:val="single" w:color="BFBFBF" w:sz="4"/>
-              <w:right w:val="none" w:color="FFFFFF" w:sz="0"/>
-            </w:tcBorders>
-            <w:tcMar>
-              <w:top w:type="dxa" w:w="40"/>
-              <w:left w:type="dxa" w:w="60"/>
-              <w:bottom w:type="dxa" w:w="40"/>
-              <w:right w:type="dxa" w:w="60"/>
-            </w:tcMar>
-            <w:vAlign w:val="top"/>
-          </w:tcPr>
-          <w:p>
-            <w:pPr>
-              <w:spacing w:after="0" w:before="0" w:line="276" w:lineRule="auto"/>
-            </w:pPr>
-            <w:r>
-              <w:rPr>
-                <w:rFonts w:ascii="Times New Roman" w:cs="Times New Roman" w:eastAsia="Times New Roman" w:hAnsi="Times New Roman"/>
-                <w:b w:val="false"/>
-                <w:bCs w:val="false"/>
-                <w:i w:val="false"/>
-                <w:iCs w:val="false"/>
-                <w:color w:val="000000"/>
-                <w:sz w:val="20"/>
-                <w:szCs w:val="20"/>
-              </w:rPr>
-              <w:t xml:space="preserve">Proposition 3</w:t>
-            </w:r>
-          </w:p>
-        </w:tc>
-        <w:tc>
-          <w:tcPr>
-            <w:tcW w:type="dxa" w:w="5160"/>
-            <w:tcBorders>
-              <w:top w:val="none" w:color="FFFFFF" w:sz="0"/>
-              <w:left w:val="none" w:color="FFFFFF" w:sz="0"/>
-              <w:bottom w:val="single" w:color="BFBFBF" w:sz="4"/>
-              <w:right w:val="none" w:color="FFFFFF" w:sz="0"/>
-            </w:tcBorders>
-            <w:tcMar>
-              <w:top w:type="dxa" w:w="40"/>
-              <w:left w:type="dxa" w:w="60"/>
-              <w:bottom w:type="dxa" w:w="40"/>
-              <w:right w:type="dxa" w:w="60"/>
-            </w:tcMar>
-            <w:vAlign w:val="top"/>
-          </w:tcPr>
-          <w:p>
-            <w:pPr>
-              <w:spacing w:after="0" w:before="0" w:line="276" w:lineRule="auto"/>
-            </w:pPr>
-            <w:r>
-              <w:rPr>
-                <w:rFonts w:ascii="Times New Roman" w:cs="Times New Roman" w:eastAsia="Times New Roman" w:hAnsi="Times New Roman"/>
-                <w:b w:val="false"/>
-                <w:bCs w:val="false"/>
-                <w:i w:val="false"/>
-                <w:iCs w:val="false"/>
-                <w:color w:val="000000"/>
-                <w:sz w:val="20"/>
-                <w:szCs w:val="20"/>
-              </w:rPr>
-              <w:t xml:space="preserve">Theorem 3. Separating likelihood.</w:t>
-            </w:r>
-          </w:p>
-        </w:tc>
-      </w:tr>
-      <w:tr>
-        <w:tc>
-          <w:tcPr>
-            <w:tcW w:type="dxa" w:w="4200"/>
-            <w:tcBorders>
-              <w:top w:val="none" w:color="FFFFFF" w:sz="0"/>
-              <w:left w:val="none" w:color="FFFFFF" w:sz="0"/>
-              <w:bottom w:val="single" w:color="BFBFBF" w:sz="4"/>
-              <w:right w:val="none" w:color="FFFFFF" w:sz="0"/>
-            </w:tcBorders>
-            <w:tcMar>
-              <w:top w:type="dxa" w:w="40"/>
-              <w:left w:type="dxa" w:w="60"/>
-              <w:bottom w:type="dxa" w:w="40"/>
-              <w:right w:type="dxa" w:w="60"/>
-            </w:tcMar>
-            <w:vAlign w:val="top"/>
-          </w:tcPr>
-          <w:p>
-            <w:pPr>
-              <w:spacing w:after="0" w:before="0" w:line="276" w:lineRule="auto"/>
-            </w:pPr>
-            <w:r>
-              <w:rPr>
-                <w:rFonts w:ascii="Times New Roman" w:cs="Times New Roman" w:eastAsia="Times New Roman" w:hAnsi="Times New Roman"/>
-                <w:b w:val="false"/>
-                <w:bCs w:val="false"/>
-                <w:i w:val="false"/>
-                <w:iCs w:val="false"/>
-                <w:color w:val="000000"/>
-                <w:sz w:val="20"/>
-                <w:szCs w:val="20"/>
-              </w:rPr>
-              <w:t xml:space="preserve">Proposition 4</w:t>
-            </w:r>
-          </w:p>
-        </w:tc>
-        <w:tc>
-          <w:tcPr>
-            <w:tcW w:type="dxa" w:w="5160"/>
-            <w:tcBorders>
-              <w:top w:val="none" w:color="FFFFFF" w:sz="0"/>
-              <w:left w:val="none" w:color="FFFFFF" w:sz="0"/>
-              <w:bottom w:val="single" w:color="BFBFBF" w:sz="4"/>
-              <w:right w:val="none" w:color="FFFFFF" w:sz="0"/>
-            </w:tcBorders>
-            <w:tcMar>
-              <w:top w:type="dxa" w:w="40"/>
-              <w:left w:type="dxa" w:w="60"/>
-              <w:bottom w:type="dxa" w:w="40"/>
-              <w:right w:type="dxa" w:w="60"/>
-            </w:tcMar>
-            <w:vAlign w:val="top"/>
-          </w:tcPr>
-          <w:p>
-            <w:pPr>
-              <w:spacing w:after="0" w:before="0" w:line="276" w:lineRule="auto"/>
-            </w:pPr>
-            <w:r>
-              <w:rPr>
-                <w:rFonts w:ascii="Times New Roman" w:cs="Times New Roman" w:eastAsia="Times New Roman" w:hAnsi="Times New Roman"/>
-                <w:b w:val="false"/>
-                <w:bCs w:val="false"/>
-                <w:i w:val="false"/>
-                <w:iCs w:val="false"/>
-                <w:color w:val="000000"/>
-                <w:sz w:val="20"/>
-                <w:szCs w:val="20"/>
-              </w:rPr>
-              <w:t xml:space="preserve">Theorem 4. Collapse and hackability split.</w:t>
-            </w:r>
-          </w:p>
-        </w:tc>
-      </w:tr>
-      <w:tr>
-        <w:tc>
-          <w:tcPr>
-            <w:tcW w:type="dxa" w:w="4200"/>
-            <w:tcBorders>
-              <w:top w:val="none" w:color="FFFFFF" w:sz="0"/>
-              <w:left w:val="none" w:color="FFFFFF" w:sz="0"/>
-              <w:bottom w:val="single" w:color="BFBFBF" w:sz="4"/>
-              <w:right w:val="none" w:color="FFFFFF" w:sz="0"/>
-            </w:tcBorders>
-            <w:tcMar>
-              <w:top w:type="dxa" w:w="40"/>
-              <w:left w:type="dxa" w:w="60"/>
-              <w:bottom w:type="dxa" w:w="40"/>
-              <w:right w:type="dxa" w:w="60"/>
-            </w:tcMar>
-            <w:vAlign w:val="top"/>
-          </w:tcPr>
-          <w:p>
-            <w:pPr>
-              <w:spacing w:after="0" w:before="0" w:line="276" w:lineRule="auto"/>
-            </w:pPr>
-            <w:r>
-              <w:rPr>
-                <w:rFonts w:ascii="Times New Roman" w:cs="Times New Roman" w:eastAsia="Times New Roman" w:hAnsi="Times New Roman"/>
-                <w:b w:val="false"/>
-                <w:bCs w:val="false"/>
-                <w:i w:val="false"/>
-                <w:iCs w:val="false"/>
-                <w:color w:val="000000"/>
-                <w:sz w:val="20"/>
-                <w:szCs w:val="20"/>
-              </w:rPr>
-              <w:t xml:space="preserve">Proposition 5</w:t>
-            </w:r>
-          </w:p>
-        </w:tc>
-        <w:tc>
-          <w:tcPr>
-            <w:tcW w:type="dxa" w:w="5160"/>
-            <w:tcBorders>
-              <w:top w:val="none" w:color="FFFFFF" w:sz="0"/>
-              <w:left w:val="none" w:color="FFFFFF" w:sz="0"/>
-              <w:bottom w:val="single" w:color="BFBFBF" w:sz="4"/>
-              <w:right w:val="none" w:color="FFFFFF" w:sz="0"/>
-            </w:tcBorders>
-            <w:tcMar>
-              <w:top w:type="dxa" w:w="40"/>
-              <w:left w:type="dxa" w:w="60"/>
-              <w:bottom w:type="dxa" w:w="40"/>
-              <w:right w:type="dxa" w:w="60"/>
-            </w:tcMar>
-            <w:vAlign w:val="top"/>
-          </w:tcPr>
-          <w:p>
-            <w:pPr>
-              <w:spacing w:after="0" w:before="0" w:line="276" w:lineRule="auto"/>
-            </w:pPr>
-            <w:r>
-              <w:rPr>
-                <w:rFonts w:ascii="Times New Roman" w:cs="Times New Roman" w:eastAsia="Times New Roman" w:hAnsi="Times New Roman"/>
-                <w:b w:val="false"/>
-                <w:bCs w:val="false"/>
-                <w:i w:val="false"/>
-                <w:iCs w:val="false"/>
-                <w:color w:val="000000"/>
-                <w:sz w:val="20"/>
-                <w:szCs w:val="20"/>
-              </w:rPr>
-              <w:t xml:space="preserve">Theorem 5. Ignored intercept shift.</w:t>
-            </w:r>
-          </w:p>
-        </w:tc>
-      </w:tr>
-      <w:tr>
-        <w:tc>
-          <w:tcPr>
-            <w:tcW w:type="dxa" w:w="4200"/>
-            <w:tcBorders>
-              <w:top w:val="none" w:color="FFFFFF" w:sz="0"/>
-              <w:left w:val="none" w:color="FFFFFF" w:sz="0"/>
-              <w:bottom w:val="single" w:color="BFBFBF" w:sz="4"/>
-              <w:right w:val="none" w:color="FFFFFF" w:sz="0"/>
-            </w:tcBorders>
-            <w:tcMar>
-              <w:top w:type="dxa" w:w="40"/>
-              <w:left w:type="dxa" w:w="60"/>
-              <w:bottom w:type="dxa" w:w="40"/>
-              <w:right w:type="dxa" w:w="60"/>
-            </w:tcMar>
-            <w:vAlign w:val="top"/>
-          </w:tcPr>
-          <w:p>
-            <w:pPr>
-              <w:spacing w:after="0" w:before="0" w:line="276" w:lineRule="auto"/>
-            </w:pPr>
-            <w:r>
-              <w:rPr>
-                <w:rFonts w:ascii="Times New Roman" w:cs="Times New Roman" w:eastAsia="Times New Roman" w:hAnsi="Times New Roman"/>
-                <w:b w:val="false"/>
-                <w:bCs w:val="false"/>
-                <w:i w:val="false"/>
-                <w:iCs w:val="false"/>
-                <w:color w:val="000000"/>
-                <w:sz w:val="20"/>
-                <w:szCs w:val="20"/>
-              </w:rPr>
-              <w:t xml:space="preserve">Energy identity</w:t>
-            </w:r>
-          </w:p>
-        </w:tc>
-        <w:tc>
-          <w:tcPr>
-            <w:tcW w:type="dxa" w:w="5160"/>
-            <w:tcBorders>
-              <w:top w:val="none" w:color="FFFFFF" w:sz="0"/>
-              <w:left w:val="none" w:color="FFFFFF" w:sz="0"/>
-              <w:bottom w:val="single" w:color="BFBFBF" w:sz="4"/>
-              <w:right w:val="none" w:color="FFFFFF" w:sz="0"/>
-            </w:tcBorders>
-            <w:tcMar>
-              <w:top w:type="dxa" w:w="40"/>
-              <w:left w:type="dxa" w:w="60"/>
-              <w:bottom w:type="dxa" w:w="40"/>
-              <w:right w:type="dxa" w:w="60"/>
-            </w:tcMar>
-            <w:vAlign w:val="top"/>
-          </w:tcPr>
-          <w:p>
-            <w:pPr>
-              <w:spacing w:after="0" w:before="0" w:line="276" w:lineRule="auto"/>
-            </w:pPr>
-            <w:r>
-              <w:rPr>
-                <w:rFonts w:ascii="Times New Roman" w:cs="Times New Roman" w:eastAsia="Times New Roman" w:hAnsi="Times New Roman"/>
-                <w:b w:val="false"/>
-                <w:bCs w:val="false"/>
-                <w:i w:val="false"/>
-                <w:iCs w:val="false"/>
-                <w:color w:val="000000"/>
-                <w:sz w:val="20"/>
-                <w:szCs w:val="20"/>
-              </w:rPr>
-              <w:t xml:space="preserve">Dropped. Watts are a unit of I or cG.</w:t>
-            </w:r>
-          </w:p>
-        </w:tc>
-      </w:tr>
-      <w:tr>
-        <w:tc>
-          <w:tcPr>
-            <w:tcW w:type="dxa" w:w="4200"/>
-            <w:tcBorders>
-              <w:top w:val="none" w:color="FFFFFF" w:sz="0"/>
-              <w:left w:val="none" w:color="FFFFFF" w:sz="0"/>
-              <w:bottom w:val="single" w:color="BFBFBF" w:sz="4"/>
-              <w:right w:val="none" w:color="FFFFFF" w:sz="0"/>
-            </w:tcBorders>
-            <w:tcMar>
-              <w:top w:type="dxa" w:w="40"/>
-              <w:left w:type="dxa" w:w="60"/>
-              <w:bottom w:type="dxa" w:w="40"/>
-              <w:right w:type="dxa" w:w="60"/>
-            </w:tcMar>
-            <w:vAlign w:val="top"/>
-          </w:tcPr>
-          <w:p>
-            <w:pPr>
-              <w:spacing w:after="0" w:before="0" w:line="276" w:lineRule="auto"/>
-            </w:pPr>
-            <w:r>
-              <w:rPr>
-                <w:rFonts w:ascii="Times New Roman" w:cs="Times New Roman" w:eastAsia="Times New Roman" w:hAnsi="Times New Roman"/>
-                <w:b w:val="false"/>
-                <w:bCs w:val="false"/>
-                <w:i w:val="false"/>
-                <w:iCs w:val="false"/>
-                <w:color w:val="000000"/>
-                <w:sz w:val="20"/>
-                <w:szCs w:val="20"/>
-              </w:rPr>
-              <w:t xml:space="preserve">Field protocol</w:t>
-            </w:r>
-          </w:p>
-        </w:tc>
-        <w:tc>
-          <w:tcPr>
-            <w:tcW w:type="dxa" w:w="5160"/>
-            <w:tcBorders>
-              <w:top w:val="none" w:color="FFFFFF" w:sz="0"/>
-              <w:left w:val="none" w:color="FFFFFF" w:sz="0"/>
-              <w:bottom w:val="single" w:color="BFBFBF" w:sz="4"/>
-              <w:right w:val="none" w:color="FFFFFF" w:sz="0"/>
-            </w:tcBorders>
-            <w:tcMar>
-              <w:top w:type="dxa" w:w="40"/>
-              <w:left w:type="dxa" w:w="60"/>
-              <w:bottom w:type="dxa" w:w="40"/>
-              <w:right w:type="dxa" w:w="60"/>
-            </w:tcMar>
-            <w:vAlign w:val="top"/>
-          </w:tcPr>
-          <w:p>
-            <w:pPr>
-              <w:spacing w:after="0" w:before="0" w:line="276" w:lineRule="auto"/>
-            </w:pPr>
-            <w:r>
-              <w:rPr>
-                <w:rFonts w:ascii="Times New Roman" w:cs="Times New Roman" w:eastAsia="Times New Roman" w:hAnsi="Times New Roman"/>
-                <w:b w:val="false"/>
-                <w:bCs w:val="false"/>
-                <w:i w:val="false"/>
-                <w:iCs w:val="false"/>
-                <w:color w:val="000000"/>
-                <w:sz w:val="20"/>
-                <w:szCs w:val="20"/>
-              </w:rPr>
-              <w:t xml:space="preserve">Reduced to rejection conditions in Section 6.</w:t>
-            </w:r>
-          </w:p>
-        </w:tc>
-      </w:tr>
-      <w:tr>
-        <w:tc>
-          <w:tcPr>
-            <w:tcW w:type="dxa" w:w="4200"/>
-            <w:tcBorders>
-              <w:top w:val="none" w:color="FFFFFF" w:sz="0"/>
-              <w:left w:val="none" w:color="FFFFFF" w:sz="0"/>
-              <w:bottom w:val="single" w:color="000000" w:sz="8"/>
-              <w:right w:val="none" w:color="FFFFFF" w:sz="0"/>
-            </w:tcBorders>
-            <w:tcMar>
-              <w:top w:type="dxa" w:w="40"/>
-              <w:left w:type="dxa" w:w="60"/>
-              <w:bottom w:type="dxa" w:w="40"/>
-              <w:right w:type="dxa" w:w="60"/>
-            </w:tcMar>
-            <w:vAlign w:val="top"/>
-          </w:tcPr>
-          <w:p>
-            <w:pPr>
-              <w:spacing w:after="0" w:before="0" w:line="276" w:lineRule="auto"/>
-            </w:pPr>
-            <w:r>
-              <w:rPr>
-                <w:rFonts w:ascii="Times New Roman" w:cs="Times New Roman" w:eastAsia="Times New Roman" w:hAnsi="Times New Roman"/>
-                <w:b w:val="false"/>
-                <w:bCs w:val="false"/>
-                <w:i w:val="false"/>
-                <w:iCs w:val="false"/>
-                <w:color w:val="000000"/>
-                <w:sz w:val="20"/>
-                <w:szCs w:val="20"/>
-              </w:rPr>
-              <w:t xml:space="preserve">Twenty-two-ticket ledger</w:t>
-            </w:r>
-          </w:p>
-        </w:tc>
-        <w:tc>
-          <w:tcPr>
-            <w:tcW w:type="dxa" w:w="5160"/>
-            <w:tcBorders>
-              <w:top w:val="none" w:color="FFFFFF" w:sz="0"/>
-              <w:left w:val="none" w:color="FFFFFF" w:sz="0"/>
-              <w:bottom w:val="single" w:color="000000" w:sz="8"/>
-              <w:right w:val="none" w:color="FFFFFF" w:sz="0"/>
-            </w:tcBorders>
-            <w:tcMar>
-              <w:top w:type="dxa" w:w="40"/>
-              <w:left w:type="dxa" w:w="60"/>
-              <w:bottom w:type="dxa" w:w="40"/>
-              <w:right w:type="dxa" w:w="60"/>
-            </w:tcMar>
-            <w:vAlign w:val="top"/>
-          </w:tcPr>
-          <w:p>
-            <w:pPr>
-              <w:spacing w:after="0" w:before="0" w:line="276" w:lineRule="auto"/>
-            </w:pPr>
-            <w:r>
-              <w:rPr>
-                <w:rFonts w:ascii="Times New Roman" w:cs="Times New Roman" w:eastAsia="Times New Roman" w:hAnsi="Times New Roman"/>
-                <w:b w:val="false"/>
-                <w:bCs w:val="false"/>
-                <w:i w:val="false"/>
-                <w:iCs w:val="false"/>
-                <w:color w:val="000000"/>
-                <w:sz w:val="20"/>
-                <w:szCs w:val="20"/>
-              </w:rPr>
-              <w:t xml:space="preserve">Table 5, sign check only.</w:t>
-            </w:r>
-          </w:p>
-        </w:tc>
-      </w:tr>
-    </w:tbl>
-    <w:p>
-      <w:pPr>
-        <w:spacing w:after="0" w:before="0" w:line="480" w:lineRule="auto"/>
-        <w:jc w:val="both"/>
-      </w:pPr>
-      <w:r>
-        <w:rPr>
-          <w:rFonts w:ascii="Times New Roman" w:cs="Times New Roman" w:eastAsia="Times New Roman" w:hAnsi="Times New Roman"/>
-          <w:b w:val="false"/>
-          <w:bCs w:val="false"/>
-          <w:i w:val="false"/>
-          <w:iCs w:val="false"/>
-          <w:color w:val="000000"/>
-          <w:sz w:val="22"/>
-          <w:szCs w:val="22"/>
-        </w:rPr>
-        <w:t xml:space="preserve"/>
-      </w:r>
-    </w:p>
-    <w:p>
-      <w:pPr>
-        <w:spacing w:after="0" w:before="0" w:line="480" w:lineRule="auto"/>
-        <w:jc w:val="both"/>
-      </w:pPr>
-      <w:r>
-        <w:rPr>
-          <w:rFonts w:ascii="Times New Roman" w:cs="Times New Roman" w:eastAsia="Times New Roman" w:hAnsi="Times New Roman"/>
-          <w:b w:val="false"/>
-          <w:bCs w:val="false"/>
-          <w:i/>
-          <w:iCs/>
-          <w:color w:val="000000"/>
-          <w:sz w:val="20"/>
-          <w:szCs w:val="20"/>
-        </w:rPr>
-        <w:t xml:space="preserve">Table A.1. Objects carried from the earlier draft, and objects dropped.</w:t>
       </w:r>
     </w:p>
     <w:p>

</xml_diff>